<commit_message>
docs: regeneration Word apres rendu libre 3 portes
Co-Authored-By: Claude Opus 4.6 (1M context) <noreply@anthropic.com>
</commit_message>
<xml_diff>
--- a/ECRITS_NIYYAH/cure_medisance.docx
+++ b/ECRITS_NIYYAH/cure_medisance.docx
@@ -156,7 +156,7 @@
           <w:sz w:val="22"/>
           <w:szCs w:val="22"/>
         </w:rPr>
-        <w:t xml:space="preserve">Ihyâ' 'Ulûm ad-Dîn, Livre XXIV — Kitâb âfât al-lisân</w:t>
+        <w:t xml:space="preserve">Ihyâ' 'Ulûm ad-Dîn, Livre XXIV — Kitâb âfât al-lisân (rendu libre)</w:t>
       </w:r>
     </w:p>
     <w:p>
@@ -725,7 +725,7 @@
           <w:sz w:val="22"/>
           <w:szCs w:val="22"/>
         </w:rPr>
-        <w:t xml:space="preserve">Ihyâ' 'Ulûm ad-Dîn, Livre XXIV — bawâ'ith al-ghîba</w:t>
+        <w:t xml:space="preserve">Ihyâ' 'Ulûm ad-Dîn, Livre XXIV — bawâ'ith al-ghîba (rendu libre)</w:t>
       </w:r>
     </w:p>
     <w:p>

</xml_diff>